<commit_message>
docs: update source to bronze mapping document to follow naming convention
</commit_message>
<xml_diff>
--- a/docs/source-to-target-mapping/source_to_bronze.docx
+++ b/docs/source-to-target-mapping/source_to_bronze.docx
@@ -246,16 +246,25 @@
                 <w:rFonts w:ascii="Times New Roman" w:hAnsi="Times New Roman" w:cs="Times New Roman"/>
                 <w:sz w:val="26"/>
                 <w:szCs w:val="26"/>
-              </w:rPr>
-              <w:t>_</w:t>
-            </w:r>
-            <w:r>
-              <w:rPr>
-                <w:rFonts w:ascii="Times New Roman" w:hAnsi="Times New Roman" w:cs="Times New Roman"/>
-                <w:sz w:val="26"/>
-                <w:szCs w:val="26"/>
-              </w:rPr>
-              <w:t>audit_session_id</w:t>
+                <w:lang w:val="vi-VN"/>
+              </w:rPr>
+              <w:t>_batch</w:t>
+            </w:r>
+            <w:r>
+              <w:rPr>
+                <w:rFonts w:ascii="Times New Roman" w:hAnsi="Times New Roman" w:cs="Times New Roman"/>
+                <w:sz w:val="26"/>
+                <w:szCs w:val="26"/>
+              </w:rPr>
+              <w:t xml:space="preserve"> </w:t>
+            </w:r>
+            <w:r>
+              <w:rPr>
+                <w:rFonts w:ascii="Times New Roman" w:hAnsi="Times New Roman" w:cs="Times New Roman"/>
+                <w:sz w:val="26"/>
+                <w:szCs w:val="26"/>
+              </w:rPr>
+              <w:t>_id</w:t>
             </w:r>
           </w:p>
         </w:tc>
@@ -282,7 +291,24 @@
                 <w:sz w:val="26"/>
                 <w:szCs w:val="26"/>
               </w:rPr>
-              <w:t>Identifier of the ingestion session.</w:t>
+              <w:t xml:space="preserve">Unique identifier of the logical data </w:t>
+            </w:r>
+            <w:r>
+              <w:rPr>
+                <w:rFonts w:ascii="Times New Roman" w:hAnsi="Times New Roman" w:cs="Times New Roman"/>
+                <w:sz w:val="26"/>
+                <w:szCs w:val="26"/>
+              </w:rPr>
+              <w:t>batch</w:t>
+            </w:r>
+            <w:r>
+              <w:rPr>
+                <w:rFonts w:ascii="Times New Roman" w:hAnsi="Times New Roman" w:cs="Times New Roman"/>
+                <w:sz w:val="26"/>
+                <w:szCs w:val="26"/>
+                <w:lang w:val="vi-VN"/>
+              </w:rPr>
+              <w:t>.</w:t>
             </w:r>
           </w:p>
         </w:tc>
@@ -311,7 +337,15 @@
                 <w:sz w:val="26"/>
                 <w:szCs w:val="26"/>
               </w:rPr>
-              <w:t>_loaded_ts</w:t>
+              <w:t>_loaded_</w:t>
+            </w:r>
+            <w:r>
+              <w:rPr>
+                <w:rFonts w:ascii="Times New Roman" w:hAnsi="Times New Roman" w:cs="Times New Roman"/>
+                <w:sz w:val="26"/>
+                <w:szCs w:val="26"/>
+              </w:rPr>
+              <w:t>at</w:t>
             </w:r>
           </w:p>
         </w:tc>
@@ -784,9 +818,6 @@
         <w:t>bronze.</w:t>
       </w:r>
       <w:r>
-        <w:t xml:space="preserve"> </w:t>
-      </w:r>
-      <w:r>
         <w:rPr>
           <w:rFonts w:ascii="Times New Roman" w:hAnsi="Times New Roman" w:cs="Times New Roman"/>
           <w:sz w:val="26"/>
@@ -800,7 +831,7 @@
           <w:sz w:val="26"/>
           <w:szCs w:val="26"/>
         </w:rPr>
-        <w:t>ncellations</w:t>
+        <w:t>ncellation</w:t>
       </w:r>
       <w:r>
         <w:rPr>
@@ -3121,15 +3152,24 @@
                 <w:rFonts w:ascii="Times New Roman" w:hAnsi="Times New Roman" w:cs="Times New Roman"/>
                 <w:sz w:val="26"/>
                 <w:szCs w:val="26"/>
-              </w:rPr>
-            </w:pPr>
-            <w:r>
-              <w:rPr>
-                <w:rFonts w:ascii="Times New Roman" w:hAnsi="Times New Roman" w:cs="Times New Roman"/>
-                <w:sz w:val="26"/>
-                <w:szCs w:val="26"/>
-              </w:rPr>
-              <w:t>_loaded_ts</w:t>
+                <w:lang w:val="vi-VN"/>
+              </w:rPr>
+            </w:pPr>
+            <w:r>
+              <w:rPr>
+                <w:rFonts w:ascii="Times New Roman" w:hAnsi="Times New Roman" w:cs="Times New Roman"/>
+                <w:sz w:val="26"/>
+                <w:szCs w:val="26"/>
+              </w:rPr>
+              <w:t>_loaded_</w:t>
+            </w:r>
+            <w:r>
+              <w:rPr>
+                <w:rFonts w:ascii="Times New Roman" w:hAnsi="Times New Roman" w:cs="Times New Roman"/>
+                <w:sz w:val="26"/>
+                <w:szCs w:val="26"/>
+              </w:rPr>
+              <w:t>at</w:t>
             </w:r>
           </w:p>
         </w:tc>
@@ -3814,7 +3854,7 @@
           <w:szCs w:val="26"/>
           <w:lang w:val="vi-VN"/>
         </w:rPr>
-        <w:t>payments.</w:t>
+        <w:t>payment.</w:t>
       </w:r>
     </w:p>
     <w:p>
@@ -6562,15 +6602,24 @@
                 <w:rFonts w:ascii="Times New Roman" w:hAnsi="Times New Roman" w:cs="Times New Roman"/>
                 <w:sz w:val="26"/>
                 <w:szCs w:val="26"/>
-              </w:rPr>
-            </w:pPr>
-            <w:r>
-              <w:rPr>
-                <w:rFonts w:ascii="Times New Roman" w:hAnsi="Times New Roman" w:cs="Times New Roman"/>
-                <w:sz w:val="26"/>
-                <w:szCs w:val="26"/>
-              </w:rPr>
-              <w:t>_loaded_ts</w:t>
+                <w:lang w:val="vi-VN"/>
+              </w:rPr>
+            </w:pPr>
+            <w:r>
+              <w:rPr>
+                <w:rFonts w:ascii="Times New Roman" w:hAnsi="Times New Roman" w:cs="Times New Roman"/>
+                <w:sz w:val="26"/>
+                <w:szCs w:val="26"/>
+              </w:rPr>
+              <w:t>_loaded_</w:t>
+            </w:r>
+            <w:r>
+              <w:rPr>
+                <w:rFonts w:ascii="Times New Roman" w:hAnsi="Times New Roman" w:cs="Times New Roman"/>
+                <w:sz w:val="26"/>
+                <w:szCs w:val="26"/>
+              </w:rPr>
+              <w:t>at</w:t>
             </w:r>
           </w:p>
         </w:tc>
@@ -7224,7 +7273,16 @@
           <w:szCs w:val="26"/>
           <w:lang w:val="vi-VN"/>
         </w:rPr>
-        <w:t>policies.</w:t>
+        <w:t>policy</w:t>
+      </w:r>
+      <w:r>
+        <w:rPr>
+          <w:rFonts w:ascii="Times New Roman" w:hAnsi="Times New Roman" w:cs="Times New Roman"/>
+          <w:sz w:val="26"/>
+          <w:szCs w:val="26"/>
+          <w:lang w:val="vi-VN"/>
+        </w:rPr>
+        <w:t>.</w:t>
       </w:r>
     </w:p>
     <w:p>
@@ -10522,15 +10580,24 @@
                 <w:rFonts w:ascii="Times New Roman" w:hAnsi="Times New Roman" w:cs="Times New Roman"/>
                 <w:sz w:val="26"/>
                 <w:szCs w:val="26"/>
-              </w:rPr>
-            </w:pPr>
-            <w:r>
-              <w:rPr>
-                <w:rFonts w:ascii="Times New Roman" w:hAnsi="Times New Roman" w:cs="Times New Roman"/>
-                <w:sz w:val="26"/>
-                <w:szCs w:val="26"/>
-              </w:rPr>
-              <w:t>_loaded_ts</w:t>
+                <w:lang w:val="vi-VN"/>
+              </w:rPr>
+            </w:pPr>
+            <w:r>
+              <w:rPr>
+                <w:rFonts w:ascii="Times New Roman" w:hAnsi="Times New Roman" w:cs="Times New Roman"/>
+                <w:sz w:val="26"/>
+                <w:szCs w:val="26"/>
+              </w:rPr>
+              <w:t>_loaded_</w:t>
+            </w:r>
+            <w:r>
+              <w:rPr>
+                <w:rFonts w:ascii="Times New Roman" w:hAnsi="Times New Roman" w:cs="Times New Roman"/>
+                <w:sz w:val="26"/>
+                <w:szCs w:val="26"/>
+              </w:rPr>
+              <w:t>at</w:t>
             </w:r>
           </w:p>
         </w:tc>
@@ -11226,7 +11293,7 @@
           <w:szCs w:val="26"/>
           <w:lang w:val="vi-VN"/>
         </w:rPr>
-        <w:t>customers.</w:t>
+        <w:t>customer.</w:t>
       </w:r>
     </w:p>
     <w:tbl>
@@ -13748,15 +13815,24 @@
                 <w:rFonts w:ascii="Times New Roman" w:hAnsi="Times New Roman" w:cs="Times New Roman"/>
                 <w:sz w:val="26"/>
                 <w:szCs w:val="26"/>
-              </w:rPr>
-            </w:pPr>
-            <w:r>
-              <w:rPr>
-                <w:rFonts w:ascii="Times New Roman" w:hAnsi="Times New Roman" w:cs="Times New Roman"/>
-                <w:sz w:val="26"/>
-                <w:szCs w:val="26"/>
-              </w:rPr>
-              <w:t>_loaded_ts</w:t>
+                <w:lang w:val="vi-VN"/>
+              </w:rPr>
+            </w:pPr>
+            <w:r>
+              <w:rPr>
+                <w:rFonts w:ascii="Times New Roman" w:hAnsi="Times New Roman" w:cs="Times New Roman"/>
+                <w:sz w:val="26"/>
+                <w:szCs w:val="26"/>
+              </w:rPr>
+              <w:t>_loaded_</w:t>
+            </w:r>
+            <w:r>
+              <w:rPr>
+                <w:rFonts w:ascii="Times New Roman" w:hAnsi="Times New Roman" w:cs="Times New Roman"/>
+                <w:sz w:val="26"/>
+                <w:szCs w:val="26"/>
+              </w:rPr>
+              <w:t>at</w:t>
             </w:r>
           </w:p>
         </w:tc>
@@ -14360,7 +14436,7 @@
           <w:szCs w:val="26"/>
           <w:lang w:val="vi-VN"/>
         </w:rPr>
-        <w:t>agents.</w:t>
+        <w:t>agent.</w:t>
       </w:r>
     </w:p>
     <w:p>
@@ -16191,15 +16267,24 @@
                 <w:rFonts w:ascii="Times New Roman" w:hAnsi="Times New Roman" w:cs="Times New Roman"/>
                 <w:sz w:val="26"/>
                 <w:szCs w:val="26"/>
-              </w:rPr>
-            </w:pPr>
-            <w:r>
-              <w:rPr>
-                <w:rFonts w:ascii="Times New Roman" w:hAnsi="Times New Roman" w:cs="Times New Roman"/>
-                <w:sz w:val="26"/>
-                <w:szCs w:val="26"/>
-              </w:rPr>
-              <w:t>_loaded_ts</w:t>
+                <w:lang w:val="vi-VN"/>
+              </w:rPr>
+            </w:pPr>
+            <w:r>
+              <w:rPr>
+                <w:rFonts w:ascii="Times New Roman" w:hAnsi="Times New Roman" w:cs="Times New Roman"/>
+                <w:sz w:val="26"/>
+                <w:szCs w:val="26"/>
+              </w:rPr>
+              <w:t>_loaded_</w:t>
+            </w:r>
+            <w:r>
+              <w:rPr>
+                <w:rFonts w:ascii="Times New Roman" w:hAnsi="Times New Roman" w:cs="Times New Roman"/>
+                <w:sz w:val="26"/>
+                <w:szCs w:val="26"/>
+              </w:rPr>
+              <w:t>at</w:t>
             </w:r>
           </w:p>
         </w:tc>
@@ -16885,7 +16970,7 @@
           <w:szCs w:val="26"/>
           <w:lang w:val="vi-VN"/>
         </w:rPr>
-        <w:t>providers.</w:t>
+        <w:t>provider.</w:t>
       </w:r>
     </w:p>
     <w:p>
@@ -18531,15 +18616,24 @@
                 <w:rFonts w:ascii="Times New Roman" w:hAnsi="Times New Roman" w:cs="Times New Roman"/>
                 <w:sz w:val="26"/>
                 <w:szCs w:val="26"/>
-              </w:rPr>
-            </w:pPr>
-            <w:r>
-              <w:rPr>
-                <w:rFonts w:ascii="Times New Roman" w:hAnsi="Times New Roman" w:cs="Times New Roman"/>
-                <w:sz w:val="26"/>
-                <w:szCs w:val="26"/>
-              </w:rPr>
-              <w:t>_loaded_ts</w:t>
+                <w:lang w:val="vi-VN"/>
+              </w:rPr>
+            </w:pPr>
+            <w:r>
+              <w:rPr>
+                <w:rFonts w:ascii="Times New Roman" w:hAnsi="Times New Roman" w:cs="Times New Roman"/>
+                <w:sz w:val="26"/>
+                <w:szCs w:val="26"/>
+              </w:rPr>
+              <w:t>_loaded_</w:t>
+            </w:r>
+            <w:r>
+              <w:rPr>
+                <w:rFonts w:ascii="Times New Roman" w:hAnsi="Times New Roman" w:cs="Times New Roman"/>
+                <w:sz w:val="26"/>
+                <w:szCs w:val="26"/>
+              </w:rPr>
+              <w:t>at</w:t>
             </w:r>
           </w:p>
         </w:tc>
@@ -19393,7 +19487,7 @@
           <w:szCs w:val="26"/>
           <w:lang w:val="vi-VN"/>
         </w:rPr>
-        <w:t>vehicles.</w:t>
+        <w:t>vehicle.</w:t>
       </w:r>
     </w:p>
     <w:p>
@@ -21832,15 +21926,24 @@
                 <w:rFonts w:ascii="Times New Roman" w:hAnsi="Times New Roman" w:cs="Times New Roman"/>
                 <w:sz w:val="26"/>
                 <w:szCs w:val="26"/>
-              </w:rPr>
-            </w:pPr>
-            <w:r>
-              <w:rPr>
-                <w:rFonts w:ascii="Times New Roman" w:hAnsi="Times New Roman" w:cs="Times New Roman"/>
-                <w:sz w:val="26"/>
-                <w:szCs w:val="26"/>
-              </w:rPr>
-              <w:t>_loaded_ts</w:t>
+                <w:lang w:val="vi-VN"/>
+              </w:rPr>
+            </w:pPr>
+            <w:r>
+              <w:rPr>
+                <w:rFonts w:ascii="Times New Roman" w:hAnsi="Times New Roman" w:cs="Times New Roman"/>
+                <w:sz w:val="26"/>
+                <w:szCs w:val="26"/>
+              </w:rPr>
+              <w:t>_loaded_</w:t>
+            </w:r>
+            <w:r>
+              <w:rPr>
+                <w:rFonts w:ascii="Times New Roman" w:hAnsi="Times New Roman" w:cs="Times New Roman"/>
+                <w:sz w:val="26"/>
+                <w:szCs w:val="26"/>
+              </w:rPr>
+              <w:t>at</w:t>
             </w:r>
           </w:p>
         </w:tc>
@@ -22497,7 +22600,7 @@
           <w:szCs w:val="26"/>
           <w:lang w:val="vi-VN"/>
         </w:rPr>
-        <w:t>quotations.</w:t>
+        <w:t>quotation.</w:t>
       </w:r>
     </w:p>
     <w:p>
@@ -25308,15 +25411,24 @@
                 <w:rFonts w:ascii="Times New Roman" w:hAnsi="Times New Roman" w:cs="Times New Roman"/>
                 <w:sz w:val="26"/>
                 <w:szCs w:val="26"/>
-              </w:rPr>
-            </w:pPr>
-            <w:r>
-              <w:rPr>
-                <w:rFonts w:ascii="Times New Roman" w:hAnsi="Times New Roman" w:cs="Times New Roman"/>
-                <w:sz w:val="26"/>
-                <w:szCs w:val="26"/>
-              </w:rPr>
-              <w:t>_loaded_ts</w:t>
+                <w:lang w:val="vi-VN"/>
+              </w:rPr>
+            </w:pPr>
+            <w:r>
+              <w:rPr>
+                <w:rFonts w:ascii="Times New Roman" w:hAnsi="Times New Roman" w:cs="Times New Roman"/>
+                <w:sz w:val="26"/>
+                <w:szCs w:val="26"/>
+              </w:rPr>
+              <w:t>_loaded_</w:t>
+            </w:r>
+            <w:r>
+              <w:rPr>
+                <w:rFonts w:ascii="Times New Roman" w:hAnsi="Times New Roman" w:cs="Times New Roman"/>
+                <w:sz w:val="26"/>
+                <w:szCs w:val="26"/>
+              </w:rPr>
+              <w:t>at</w:t>
             </w:r>
           </w:p>
         </w:tc>
@@ -25959,7 +26071,7 @@
           <w:szCs w:val="26"/>
           <w:lang w:val="vi-VN"/>
         </w:rPr>
-        <w:t>items.</w:t>
+        <w:t>item.</w:t>
       </w:r>
     </w:p>
     <w:p>
@@ -27882,7 +27994,7 @@
                 <w:sz w:val="26"/>
                 <w:szCs w:val="26"/>
               </w:rPr>
-              <w:t>ts</w:t>
+              <w:t>at</w:t>
             </w:r>
           </w:p>
         </w:tc>
@@ -29872,6 +29984,52 @@
           <w:lang w:val="vi-VN"/>
         </w:rPr>
       </w:pPr>
+    </w:p>
+    <w:p>
+      <w:pPr>
+        <w:rPr>
+          <w:rFonts w:ascii="Times New Roman" w:hAnsi="Times New Roman" w:cs="Times New Roman"/>
+          <w:b/>
+          <w:bCs/>
+          <w:sz w:val="26"/>
+          <w:szCs w:val="26"/>
+          <w:lang w:val="vi-VN"/>
+        </w:rPr>
+      </w:pPr>
+      <w:r>
+        <w:rPr>
+          <w:rFonts w:ascii="Times New Roman" w:hAnsi="Times New Roman" w:cs="Times New Roman"/>
+          <w:b/>
+          <w:bCs/>
+          <w:sz w:val="26"/>
+          <w:szCs w:val="26"/>
+          <w:lang w:val="vi-VN"/>
+        </w:rPr>
+        <w:t>Note:</w:t>
+      </w:r>
+    </w:p>
+    <w:p>
+      <w:pPr>
+        <w:rPr>
+          <w:rFonts w:ascii="Times New Roman" w:hAnsi="Times New Roman" w:cs="Times New Roman"/>
+          <w:b/>
+          <w:bCs/>
+          <w:sz w:val="26"/>
+          <w:szCs w:val="26"/>
+          <w:lang w:val="vi-VN"/>
+        </w:rPr>
+      </w:pPr>
+      <w:r>
+        <w:rPr>
+          <w:rFonts w:ascii="Times New Roman" w:hAnsi="Times New Roman" w:cs="Times New Roman"/>
+          <w:b/>
+          <w:bCs/>
+          <w:sz w:val="26"/>
+          <w:szCs w:val="26"/>
+          <w:lang w:val="vi-VN"/>
+        </w:rPr>
+        <w:t>The mappings, metadata columns, and type mappings defined in this document are proposed for the current solution design and may be refined during implementation based on technical constraints, source system changes, or project requirements.</w:t>
+      </w:r>
     </w:p>
     <w:sectPr>
       <w:footerReference w:type="default" r:id="rId7"/>

</xml_diff>